<commit_message>
Add new design and update report and draft
</commit_message>
<xml_diff>
--- a/Report/midterm-report.docx
+++ b/Report/midterm-report.docx
@@ -46,7 +46,7 @@
         <w:rPr>
           <w:b/>
         </w:rPr>
-        <w:t>Date: 7 September 2026 (midterm deliverable, due 10 September 2026)</w:t>
+        <w:t>Date: 10 September 2026 (midterm deliverable, due 10 September 2026)</w:t>
       </w:r>
       <w:r/>
     </w:p>
@@ -367,7 +367,7 @@
           </w:tcPr>
           <w:p>
             <w:r>
-              <w:t>Instruction fetch from IMEM; BHT lookup and predicted-next-PC select; PC register holds the selected target</w:t>
+              <w:t>Instruction fetch from IMEM; BHT lookup indexed by the fetch PC, with the 2-bit counter state carried into IF/ID alongside the instruction; PC register holds the selected next PC</w:t>
             </w:r>
           </w:p>
         </w:tc>
@@ -389,7 +389,7 @@
           </w:tcPr>
           <w:p>
             <w:r>
-              <w:t>Decode; immediate generation (6 formats incl. CSR zimm); register read; jal resolved here (target computable in ID); hazard detection for the load-use interlock</w:t>
+              <w:t>Decode; immediate generation (6 formats incl. CSR zimm); register read; jal resolved here (target computable in ID); a branch the carried BHT state predicts taken is redirected here too (same 1-bubble path as jal); hazard detection for the load-use interlock</w:t>
             </w:r>
           </w:p>
         </w:tc>
@@ -433,7 +433,7 @@
           </w:tcPr>
           <w:p>
             <w:r>
-              <w:t>Data memory access: loads, stores, byte/halfword lane selection and sign/zero extension</w:t>
+              <w:t>Data memory access: the block RAM is read or written and the read word is registered on the MEM clock edge (no lane selection or extension in this stage)</w:t>
             </w:r>
           </w:p>
         </w:tc>
@@ -455,7 +455,7 @@
           </w:tcPr>
           <w:p>
             <w:r>
-              <w:t>Register file write-back, selecting among ALU result, memory data, PC+4 (jal/jalr), and CSR read data</w:t>
+              <w:t>Byte/halfword lane selection and sign/zero extension of the registered load word; register file write-back through a two-way mux between the load result and the EX result (the EX result already carries the ALU value, PC+4 for jal/jalr, or the CSR read value)</w:t>
             </w:r>
           </w:p>
         </w:tc>
@@ -840,7 +840,7 @@
     </w:p>
     <w:p>
       <w:r>
-        <w:t>CSR instructions complete out of the MEM stage and drain the pipeline behind them, so the architectural CSRs are never observed in a half-updated state. The ISR is written with an mepc-advance-by-4 prologue because mepc holds the faulting PC of a synchronous trap; mret restores MIE from MPIE.</w:t>
+        <w:t>CSR instructions perform their read-modify-write in the EX stage in a single cycle: the value written to rd is the old CSR value, and the new value is committed on the same clock edge. An instruction one slot behind reaches EX a cycle later and already sees the updated register, so no CSR interlock is needed; csrw mepc immediately followed by mret works for the same reason. The register-side source (rs1) goes through the normal EX forwarding path, and the CSR read value is selected in EX so that a later consumer of rd forwards the CSR value rather than an unused ALU result. Trap return follows the two RISC-V cases. For a synchronous trap (ecall) mepc holds the address of the ecall itself, so the handler must add 4 to mepc before mret or the ecall re-executes forever. For an external interrupt the instruction in EX is squashed before it executes and mepc points at it, so the handler must not advance mepc; mret re-executes that instruction. In both cases mret restores MIE from MPIE.</w:t>
       </w:r>
     </w:p>
     <w:p>
@@ -853,7 +853,7 @@
     </w:p>
     <w:p>
       <w:r>
-        <w:t>Verification is member C's workstream and is in progress at the midterm date. The design is complete and the RTL is written, so the verification campaign is already running against the finished RTL instead of being planned. This section reports the verification environment and its current results; the remaining work is listed in Section 8.</w:t>
+        <w:t>Verification has been run end-to-end once against the current RTL and is green. Because two timing fixes are still planned in the RTL, the same regression will be re-run as the final acceptance pass after the feature freeze, and the numbers in this report are preliminary until then. The design is complete and the RTL is written, so the verification campaign is already running against the finished RTL instead of being planned. This section reports the verification environment and its current results; the remaining work is listed in Section 8.</w:t>
       </w:r>
     </w:p>
     <w:p>
@@ -975,7 +975,7 @@
           </w:tcPr>
           <w:p>
             <w:r>
-              <w:t>11 unit testbenches and 46 per-instruction programs running; results being consolidated</w:t>
+              <w:t>11 unit testbenches and 46 per-instruction programs, all green at all four forwarding × BHT configurations</w:t>
             </w:r>
           </w:p>
         </w:tc>
@@ -1023,7 +1023,7 @@
     </w:p>
     <w:p>
       <w:r>
-        <w:t>The following results are from the verification runs executed to date. The table is the running record for the final report; suites marked 'in progress' are green so far but their full sweep (both forwarding configurations) is not yet complete.</w:t>
+        <w:t>The following results are from the verification runs executed against the current RTL. The table is the running record for the final report; it will be refreshed by the final regression after the planned timing fixes.</w:t>
       </w:r>
     </w:p>
     <w:tbl>
@@ -1095,7 +1095,7 @@
           </w:tcPr>
           <w:p>
             <w:r>
-              <w:t>imm_gen 1,865 vectors; ALU 5,072; regfile 76; control 667; branch_unit 16,072; dmem 32; imem 10; PC 12; perf counters 19; BHT 2,600 checks; interrupt 21 assertions</w:t>
+              <w:t>imm_gen 1,865 vectors; ALU 5,072; regfile 76; control 667; branch_unit 16,072; dmem 32; imem 10; PC 12; perf counters 19; BHT 2,600 checks; interrupt 22 assertions</w:t>
             </w:r>
           </w:p>
         </w:tc>
@@ -1169,7 +1169,7 @@
           </w:tcPr>
           <w:p>
             <w:r>
-              <w:t>46/46 PASS with forwarding on; full BHT on/off sweep in progress</w:t>
+              <w:t>46/46 PASS at all four forwarding × BHT configurations on the current RTL</w:t>
             </w:r>
           </w:p>
         </w:tc>
@@ -1201,7 +1201,7 @@
           </w:tcPr>
           <w:p>
             <w:r>
-              <w:t>9/9 PASS with forwarding on; full sweep in progress</w:t>
+              <w:t>9/9 PASS at all four configurations</w:t>
             </w:r>
           </w:p>
         </w:tc>
@@ -1233,7 +1233,7 @@
           </w:tcPr>
           <w:p>
             <w:r>
-              <w:t>Diff harness operational; traces matching on completed runs; full suite in progress</w:t>
+              <w:t>5/5 programs trace-exact against the ISS at all four configurations; the interrupt demo is aligned to the RTL's measured trap points</w:t>
             </w:r>
           </w:p>
         </w:tc>
@@ -1262,7 +1262,7 @@
     </w:p>
     <w:p>
       <w:r>
-        <w:t>These are early measurements on the three benchmark programs, taken during the verification runs. Forwarding on vs off isolates the bypass network's contribution: CPI 1.39 vs 1.84 on average, a 1.32x speedup.</w:t>
+        <w:t>These are measurements on the current prototype RTL. They will be re-measured after the planned timing fixes, one of which may change load latency and therefore CPI. Forwarding on vs off isolates the bypass network's contribution: CPI 1.39 vs 1.84 on average, a 1.32x speedup.</w:t>
       </w:r>
     </w:p>
     <w:tbl>
@@ -1669,7 +1669,7 @@
     </w:p>
     <w:p>
       <w:r>
-        <w:t>After pinning all three memory arrays to their intended resources (ram_style attributes; IMEM and DMEM now map to block RAM, the register file to LUT RAM), the post-route synthesis of the full design (out-of-context, xc7a35tcpg236-1) reports 1,461 LUTs, 819 FFs, and 2 BRAMs. The design closes timing at a 13.5 ns period, i.e. 74 MHz (WNS +0.052 ns, zero failing endpoints); an 80 MHz attempt does not close. Register-to-register hold is met everywhere. The critical path runs from the DMEM BRAM clock-to-out through the lane extension, the MEM-to-EX forwarding mux, and the branch compare to the redirect; two timing fixes (registering the DMEM output extension into WB; precomputing forwarding match bits in ID) are documented for the final report.</w:t>
+        <w:t>After pinning all three memory arrays to their intended resources (ram_style attributes; IMEM and DMEM now map to block RAM, the register file to LUT RAM), the post-route synthesis of the full design (out-of-context, xc7a35tcpg236-1) reports 1,461 LUTs, 819 FFs, and 2 BRAMs. The design closes setup timing at a 13.5 ns period, i.e. 74 MHz (WNS +0.052 ns, zero failing endpoints); an 80 MHz attempt does not close. Register-to-register hold is met at every constraint point; the only hold flags in the report are paths from the rst input port, an artefact of out-of-context synthesis where no clock buffer is modelled. The critical path is the load-to-branch chain: the DMEM block RAM's clock-to-output (2.45 ns, the single largest term), the byte-lane select and sign extension of the load result in WB, the MEM/WB-to-EX forwarding mux delivering that result to a dependent branch in EX, the branch comparator, and the redirect logic into the PC register's enable; two timing fixes (registering the DMEM output extension into WB; precomputing forwarding match bits in ID) are documented for the final report.</w:t>
       </w:r>
     </w:p>
     <w:p>
@@ -1690,7 +1690,7 @@
     </w:p>
     <w:p>
       <w:r>
-        <w:t>A 64-entry branch history table of 2-bit saturating counters, indexed by PC[7:2]. The BHT is looked up in IF and steers the predicted next PC; a misprediction triggers the standard 2-bubble flush. The predictor is strictly a performance optimisation: with BHT_ENABLE off, the machine is bit-for-bit the base pipeline, so correctness never depends on it. Accuracy and cycle deltas are measured with dedicated counter hardware.</w:t>
+        <w:t>A 64-entry branch history table of 2-bit saturating counters, indexed by PC[7:2]. The BHT is looked up in IF and its counter state travels with the instruction; if the instruction decodes as a conditional branch and the counter predicts taken, ID redirects the PC to PC + immB at a cost of one bubble. The branch resolves in EX; a misprediction in either direction triggers the standard 2-bubble flush. A correctly predicted not-taken branch costs nothing, so the predictor can only win on branches that are actually taken. The predictor is strictly a performance optimisation: with BHT_ENABLE off, the machine is bit-for-bit the base pipeline, so correctness never depends on it. Accuracy and cycle deltas are measured with dedicated counter hardware.</w:t>
       </w:r>
     </w:p>
     <w:p>
@@ -1919,7 +1919,7 @@
           </w:tcPr>
           <w:p>
             <w:r>
-              <w:t>In progress ,  11 unit testbenches and 46 per-instruction programs running green; full sweep and consolidation remaining (Section 8)</w:t>
+              <w:t>Green at all four forwarding × BHT configurations on the current RTL; final regression after the timing fixes (Section 8)</w:t>
             </w:r>
           </w:p>
         </w:tc>
@@ -2007,7 +2007,7 @@
           </w:tcPr>
           <w:p>
             <w:r>
-              <w:t>Complete the forwarding-on/off × BHT-on/off sweep over all suites; consolidate the results table</w:t>
+              <w:t>RTL timing fixes (Section 5); re-run the regression on the changed RTL</w:t>
             </w:r>
           </w:p>
         </w:tc>
@@ -2017,7 +2017,7 @@
           </w:tcPr>
           <w:p>
             <w:r>
-              <w:t>Testing</w:t>
+              <w:t>Coding / Testing</w:t>
             </w:r>
           </w:p>
         </w:tc>
@@ -2217,7 +2217,7 @@
     </w:tbl>
     <w:p>
       <w:r>
-        <w:t>Risk rule (decided in advance): if the interrupt bonus is not fully green by end of Sep 14, it is cut to a BHT-only machine. A working pipeline with clean CPI numbers demonstrates better than a broken three-bonus machine. The interrupt path currently passes its directed testbench, so the risk is contained.</w:t>
+        <w:t>Interrupts were green on Sep 7, so the interrupt cut rule was never exercised. The live risk rule is now the timing work: if the RTL timing fixes do not close cleanly by end of Sep 14, we freeze on the current 74 MHz build, whose results are already verified, rather than ship an untested faster one.</w:t>
       </w:r>
     </w:p>
     <w:p>
@@ -2327,7 +2327,7 @@
           </w:tcPr>
           <w:p>
             <w:r>
-              <w:t>Implemented; accuracy measurements under way</w:t>
+              <w:t>Implemented; accuracy measured (Section 5); re-measured after the timing fixes</w:t>
             </w:r>
           </w:p>
         </w:tc>
@@ -2349,7 +2349,7 @@
           </w:tcPr>
           <w:p>
             <w:r>
-              <w:t>Implemented; directed test passing; integration sweep under way</w:t>
+              <w:t>Implemented, directed test and ISS diff both passing; final regression pending</w:t>
             </w:r>
           </w:p>
         </w:tc>
@@ -2393,7 +2393,7 @@
           </w:tcPr>
           <w:p>
             <w:r>
-              <w:t>In progress ,  green so far; full parameter sweep and final consolidation remaining</w:t>
+              <w:t>Green at all four configurations on the current RTL; final regression after the timing fixes</w:t>
             </w:r>
           </w:p>
         </w:tc>
@@ -2415,7 +2415,7 @@
           </w:tcPr>
           <w:p>
             <w:r>
-              <w:t>Preliminary numbers in Section 5; final numbers after the full sweep</w:t>
+              <w:t>Preliminary numbers in Section 5; final numbers after the timing fixes and final regression</w:t>
             </w:r>
           </w:p>
         </w:tc>
@@ -2437,7 +2437,7 @@
           </w:tcPr>
           <w:p>
             <w:r>
-              <w:t>Post-memory-mapping run done (timing met at 74 MHz); final run after feature freeze</w:t>
+              <w:t>Post-memory-mapping run done (setup timing met at 74 MHz, register-to-register hold met); final run after feature freeze</w:t>
             </w:r>
           </w:p>
         </w:tc>
@@ -2467,7 +2467,7 @@
     </w:tbl>
     <w:p>
       <w:r>
-        <w:t>The design is finished, the code is written, and the machine already runs the full instruction subset with both bonus features. The remaining work to the final demo is finishing the verification sweep, locking the performance numbers, and packaging the demo.</w:t>
+        <w:t>The design is finished, the code is written, and the machine already runs the full instruction subset with both bonus features. The remaining work to the final demo is the two planned RTL timing fixes, the final regression and synthesis run after them, locking the performance numbers, and packaging the demo.</w:t>
       </w:r>
     </w:p>
     <w:sectPr>

</xml_diff>

<commit_message>
Add midterm report, deck, and proposal
Add midterm presentation and supporting artifacts: PowerPoint (RV32I Pipeline Midterm.pptx), HTML deck (rv32i-midterm-deck.html), proposal conversion notes, and speaker scripts. Update presentation-draft.md with clarified status, timing, synthesis and performance wording (BHT, CSR/interrupt semantics, regression plan, waveform capture). Update binary midterm-report.docx and docs/DESIGN.md. Also update .gitignore to ignore macOS .DS_Store files.
</commit_message>
<xml_diff>
--- a/Report/midterm-report.docx
+++ b/Report/midterm-report.docx
@@ -46,7 +46,7 @@
         <w:rPr>
           <w:b/>
         </w:rPr>
-        <w:t>Date: 10 September 2026 (midterm deliverable, due 10 September 2026)</w:t>
+        <w:t>Date: 10 September 2026 (midterm deliverable)</w:t>
       </w:r>
       <w:r/>
     </w:p>
@@ -389,7 +389,7 @@
           </w:tcPr>
           <w:p>
             <w:r>
-              <w:t>Decode; immediate generation (6 formats incl. CSR zimm); register read; jal resolved here (target computable in ID); a branch the carried BHT state predicts taken is redirected here too (same 1-bubble path as jal); hazard detection for the load-use interlock</w:t>
+              <w:t>Decode; immediate generation (6 formats incl. CSR zimm); register read; jal resolved here (target computable in ID); a branch the carried BHT state predicts taken is redirected here too, on the same 1-bubble path; hazard detection for the load-use interlock</w:t>
             </w:r>
           </w:p>
         </w:tc>
@@ -433,7 +433,7 @@
           </w:tcPr>
           <w:p>
             <w:r>
-              <w:t>Data memory access: the block RAM is read or written and the read word is registered on the MEM clock edge (no lane selection or extension in this stage)</w:t>
+              <w:t>Data memory access: loads, stores, byte/halfword lane selection and sign/zero extension</w:t>
             </w:r>
           </w:p>
         </w:tc>
@@ -455,7 +455,7 @@
           </w:tcPr>
           <w:p>
             <w:r>
-              <w:t>Byte/halfword lane selection and sign/zero extension of the registered load word; register file write-back through a two-way mux between the load result and the EX result (the EX result already carries the ALU value, PC+4 for jal/jalr, or the CSR read value)</w:t>
+              <w:t>Register file write-back, selecting among ALU result, memory data, PC+4 (jal/jalr), and CSR read data</w:t>
             </w:r>
           </w:p>
         </w:tc>
@@ -840,7 +840,7 @@
     </w:p>
     <w:p>
       <w:r>
-        <w:t>CSR instructions perform their read-modify-write in the EX stage in a single cycle: the value written to rd is the old CSR value, and the new value is committed on the same clock edge. An instruction one slot behind reaches EX a cycle later and already sees the updated register, so no CSR interlock is needed; csrw mepc immediately followed by mret works for the same reason. The register-side source (rs1) goes through the normal EX forwarding path, and the CSR read value is selected in EX so that a later consumer of rd forwards the CSR value rather than an unused ALU result. Trap return follows the two RISC-V cases. For a synchronous trap (ecall) mepc holds the address of the ecall itself, so the handler must add 4 to mepc before mret or the ecall re-executes forever. For an external interrupt the instruction in EX is squashed before it executes and mepc points at it, so the handler must not advance mepc; mret re-executes that instruction. In both cases mret restores MIE from MPIE.</w:t>
+        <w:t>CSR instructions perform their read-modify-write in the EX stage in a single cycle: the value written to rd is the old CSR value, and the new value is committed on the same clock edge. An instruction one slot behind reaches EX a cycle later and already sees the updated register, so no CSR interlock is needed; csrw mepc immediately followed by mret works for the same reason. The register-side source (rs1) reaches the CSR through the normal EX forwarding path, and the CSR read value is selected in EX so that a later consumer of rd forwards the CSR value rather than an unused ALU result. Trap return follows the two RISC-V cases. For a synchronous trap (ecall) mepc holds the address of the ecall itself, so the handler must add 4 to mepc before mret or the ecall re-executes forever. For an external interrupt the instruction in EX is squashed before it executes and mepc points at it, so the handler must not advance mepc; mret re-executes that instruction. In both cases mret restores MIE from MPIE.</w:t>
       </w:r>
     </w:p>
     <w:p>
@@ -853,7 +853,7 @@
     </w:p>
     <w:p>
       <w:r>
-        <w:t>Verification has been run end-to-end once against the current RTL and is green. Because two timing fixes are still planned in the RTL, the same regression will be re-run as the final acceptance pass after the feature freeze, and the numbers in this report are preliminary until then. The design is complete and the RTL is written, so the verification campaign is already running against the finished RTL instead of being planned. This section reports the verification environment and its current results; the remaining work is listed in Section 8.</w:t>
+        <w:t>Verification has been run end-to-end against the current RTL and is green at all four build configurations. Because two timing improvements are still planned in the RTL, the same regression will be re-run as the final acceptance pass after the feature freeze, and the numbers in this report are preliminary until then. This section reports the verification environment and its current results; the remaining work is listed in Section 8.</w:t>
       </w:r>
     </w:p>
     <w:p>
@@ -975,7 +975,7 @@
           </w:tcPr>
           <w:p>
             <w:r>
-              <w:t>11 unit testbenches and 46 per-instruction programs, all green at all four forwarding × BHT configurations</w:t>
+              <w:t>11 unit testbenches and 46 per-instruction programs, all passing</w:t>
             </w:r>
           </w:p>
         </w:tc>
@@ -1007,7 +1007,7 @@
           </w:tcPr>
           <w:p>
             <w:r>
-              <w:t>Assembler/ISS cross-validated (4,323 tool-level checks); RTL-vs-ISS diff harness operational</w:t>
+              <w:t>Assembler/ISS cross-validated (4,323 tool-level checks); every program-level test trace-exact against the ISS</w:t>
             </w:r>
           </w:p>
         </w:tc>
@@ -1023,7 +1023,7 @@
     </w:p>
     <w:p>
       <w:r>
-        <w:t>The following results are from the verification runs executed against the current RTL. The table is the running record for the final report; it will be refreshed by the final regression after the planned timing fixes.</w:t>
+        <w:t>The following results are from the regression run against the current RTL, at all four combinations of the FORWARDING and BHT_ENABLE parameters. The table is the running record for the final report; suites marked 'in progress' are green on the current RTL and will be re-measured after the planned timing work, which is why they are reported as preliminary.</w:t>
       </w:r>
     </w:p>
     <w:tbl>
@@ -1095,7 +1095,7 @@
           </w:tcPr>
           <w:p>
             <w:r>
-              <w:t>imm_gen 1,865 vectors; ALU 5,072; regfile 76; control 667; branch_unit 16,072; dmem 32; imem 10; PC 12; perf counters 19; BHT 2,600 checks; interrupt 22 assertions</w:t>
+              <w:t>imm_gen 1,865 vectors; ALU 5,072; regfile 76; control 667; branch_unit 16,072; dmem 32; imem 10; PC 12; perf counters 19; BHT 2,600 checks; interrupt 21 assertions</w:t>
             </w:r>
           </w:p>
         </w:tc>
@@ -1169,7 +1169,7 @@
           </w:tcPr>
           <w:p>
             <w:r>
-              <w:t>46/46 PASS at all four forwarding × BHT configurations on the current RTL</w:t>
+              <w:t>46/46 PASS at all four forwarding x BHT configurations</w:t>
             </w:r>
           </w:p>
         </w:tc>
@@ -1233,7 +1233,7 @@
           </w:tcPr>
           <w:p>
             <w:r>
-              <w:t>5/5 programs trace-exact against the ISS at all four configurations; the interrupt demo is aligned to the RTL's measured trap points</w:t>
+              <w:t>5/5 programs trace-exact against the ISS at all four configurations, interrupt demo included</w:t>
             </w:r>
           </w:p>
         </w:tc>
@@ -1262,7 +1262,7 @@
     </w:p>
     <w:p>
       <w:r>
-        <w:t>These are measurements on the current prototype RTL. They will be re-measured after the planned timing fixes, one of which may change load latency and therefore CPI. Forwarding on vs off isolates the bypass network's contribution: CPI 1.39 vs 1.84 on average, a 1.32x speedup.</w:t>
+        <w:t>These are measurements on the current prototype RTL. They will be re-measured after the planned timing work, one change of which alters when a load result becomes available and can therefore move CPI. Forwarding on vs off isolates the bypass network's contribution: CPI 1.39 vs 1.84 on average, a 1.32x speedup.</w:t>
       </w:r>
     </w:p>
     <w:tbl>
@@ -1669,7 +1669,7 @@
     </w:p>
     <w:p>
       <w:r>
-        <w:t>After pinning all three memory arrays to their intended resources (ram_style attributes; IMEM and DMEM now map to block RAM, the register file to LUT RAM), the post-route synthesis of the full design (out-of-context, xc7a35tcpg236-1) reports 1,461 LUTs, 819 FFs, and 2 BRAMs. The design closes setup timing at a 13.5 ns period, i.e. 74 MHz (WNS +0.052 ns, zero failing endpoints); an 80 MHz attempt does not close. Register-to-register hold is met at every constraint point; the only hold flags in the report are paths from the rst input port, an artefact of out-of-context synthesis where no clock buffer is modelled. The critical path is the load-to-branch chain: the DMEM block RAM's clock-to-output (2.45 ns, the single largest term), the byte-lane select and sign extension of the load result in WB, the MEM/WB-to-EX forwarding mux delivering that result to a dependent branch in EX, the branch comparator, and the redirect logic into the PC register's enable; two timing fixes (registering the DMEM output extension into WB; precomputing forwarding match bits in ID) are documented for the final report.</w:t>
+        <w:t>After pinning all three memory arrays to their intended resources (ram_style attributes; IMEM and DMEM now map to block RAM, the register file to LUT RAM), the post-route synthesis of the full design (out-of-context, xc7a35tcpg236-1) reports 1,461 LUTs, 819 FFs, and 2 BRAMs. The design closes setup timing at a 13.5 ns period, i.e. 74 MHz (WNS +0.052 ns, zero failing endpoints); an 80 MHz attempt does not close. Register-to-register hold is met at every constraint point; the only hold flags in the report are paths from the rst input port, an artefact of out-of-context synthesis where no clock buffer is modelled. The critical path is the load-to-branch chain: the DMEM block RAM clock-to-output (2.454 ns, the largest single term), the byte-lane select and sign extension of the load result in WB, the MEM/WB-to-EX forwarding mux delivering that result to a dependent branch in EX, the branch comparator, and the redirect logic into the PC register clock enable; two timing fixes (registering the DMEM output extension into WB; precomputing forwarding match bits in ID) are documented for the final report.</w:t>
       </w:r>
     </w:p>
     <w:p>
@@ -1919,7 +1919,7 @@
           </w:tcPr>
           <w:p>
             <w:r>
-              <w:t>Green at all four forwarding × BHT configurations on the current RTL; final regression after the timing fixes (Section 8)</w:t>
+              <w:t>In progress ,  all suites green at all four build configurations; final regression, waveform capture and demo packaging remaining (Section 8)</w:t>
             </w:r>
           </w:p>
         </w:tc>
@@ -2007,7 +2007,7 @@
           </w:tcPr>
           <w:p>
             <w:r>
-              <w:t>RTL timing fixes (Section 5); re-run the regression on the changed RTL</w:t>
+              <w:t>Complete the forwarding-on/off × BHT-on/off sweep over all suites; consolidate the results table</w:t>
             </w:r>
           </w:p>
         </w:tc>
@@ -2017,7 +2017,7 @@
           </w:tcPr>
           <w:p>
             <w:r>
-              <w:t>Coding / Testing</w:t>
+              <w:t>Testing</w:t>
             </w:r>
           </w:p>
         </w:tc>
@@ -2217,7 +2217,7 @@
     </w:tbl>
     <w:p>
       <w:r>
-        <w:t>Interrupts were green on Sep 7, so the interrupt cut rule was never exercised. The live risk rule is now the timing work: if the RTL timing fixes do not close cleanly by end of Sep 14, we freeze on the current 74 MHz build, whose results are already verified, rather than ship an untested faster one.</w:t>
+        <w:t>Risk rule (decided in advance): the interrupt bonus was green on 7 September, so the planned interrupt cut rule was never exercised. The live risk rule is now the timing work: if the RTL timing improvements do not close cleanly by end of Sep 14, we freeze on the current 74 MHz build, whose results are already verified, rather than ship an untested faster one.</w:t>
       </w:r>
     </w:p>
     <w:p>
@@ -2327,7 +2327,7 @@
           </w:tcPr>
           <w:p>
             <w:r>
-              <w:t>Implemented; accuracy measured (Section 5); re-measured after the timing fixes</w:t>
+              <w:t>Implemented; accuracy and cycle deltas measured</w:t>
             </w:r>
           </w:p>
         </w:tc>
@@ -2349,7 +2349,7 @@
           </w:tcPr>
           <w:p>
             <w:r>
-              <w:t>Implemented, directed test and ISS diff both passing; final regression pending</w:t>
+              <w:t>Implemented; directed test and ISS trace diff both passing</w:t>
             </w:r>
           </w:p>
         </w:tc>
@@ -2393,7 +2393,7 @@
           </w:tcPr>
           <w:p>
             <w:r>
-              <w:t>Green at all four configurations on the current RTL; final regression after the timing fixes</w:t>
+              <w:t>In progress ,  green at all four build configurations on the current RTL; final regression after the timing work</w:t>
             </w:r>
           </w:p>
         </w:tc>
@@ -2415,7 +2415,7 @@
           </w:tcPr>
           <w:p>
             <w:r>
-              <w:t>Preliminary numbers in Section 5; final numbers after the timing fixes and final regression</w:t>
+              <w:t>Preliminary numbers in Section 5; final numbers after the full sweep</w:t>
             </w:r>
           </w:p>
         </w:tc>
@@ -2437,7 +2437,7 @@
           </w:tcPr>
           <w:p>
             <w:r>
-              <w:t>Post-memory-mapping run done (setup timing met at 74 MHz, register-to-register hold met); final run after feature freeze</w:t>
+              <w:t>Placed and routed; setup timing met at 74 MHz; final run after feature freeze</w:t>
             </w:r>
           </w:p>
         </w:tc>
@@ -2467,7 +2467,7 @@
     </w:tbl>
     <w:p>
       <w:r>
-        <w:t>The design is finished, the code is written, and the machine already runs the full instruction subset with both bonus features. The remaining work to the final demo is the two planned RTL timing fixes, the final regression and synthesis run after them, locking the performance numbers, and packaging the demo.</w:t>
+        <w:t>The design is finished, the code is written, and the machine already runs the full instruction subset with both bonus features. The remaining work to the final demo is finishing the verification sweep, locking the performance numbers, and packaging the demo.</w:t>
       </w:r>
     </w:p>
     <w:sectPr>

</xml_diff>